<commit_message>
OV03 Fix 1: isolate insulin floor (pre-resolve antibiotic deferral in draft); open CEILING-ERROR LEDGER + correct stale hypoglycemia=ceiling verdict; re-pilot prereg
</commit_message>
<xml_diff>
--- a/worlds/ondina-vasquell/phase-3-build-task-artifacts/platform/task3/current/discharge_medication_plan_draft_05242026.docx
+++ b/worlds/ondina-vasquell/phase-3-build-task-artifacts/platform/task3/current/discharge_medication_plan_draft_05242026.docx
@@ -562,7 +562,7 @@
           <w:color w:val="232830"/>
           <w:sz w:val="19"/>
         </w:rPr>
-        <w:t>Started during discharge rounds; complete Mrs. Vasquell's discharge medication plan from the chart so it is ready for attending signature. Discharge to home is planned. Home medications continue as listed unless changed; the held agents and the discharge antibiotic and the patient instructions are left for completion.</w:t>
+        <w:t>Started during discharge rounds; complete Mrs. Vasquell's discharge medication plan from the chart so it is ready for attending signature. Discharge to home is planned. Home medications continue as listed unless changed; the held agents and the patient instructions are left for completion.</w:t>
       </w:r>
     </w:p>
     <w:p>
@@ -738,7 +738,7 @@
           <w:color w:val="232830"/>
           <w:sz w:val="19"/>
         </w:rPr>
-        <w:t>To be completed from the chart.</w:t>
+        <w:t>Continue culture-directed, renally dosed therapy for the deep-tissue MSSA and group B Streptococcus. The specific oral step-down agent and total duration are deferred to Infectious Disease and were not finalized this admission.</w:t>
       </w:r>
     </w:p>
     <w:p>

</xml_diff>